<commit_message>
Prueba CM 4 videos: dos marcas en todo el texto, portafolio libre, entrega y dudas por correo, publico desde 17 anos
Co-Authored-By: Claude Fable 5.1 <noreply@anthropic.com>
</commit_message>
<xml_diff>
--- a/recursos/comercial/contratacion/COMMUNITY_MANAGER/PRUEBA_4_VIDEOS_CM.docx
+++ b/recursos/comercial/contratacion/COMMUNITY_MANAGER/PRUEBA_4_VIDEOS_CM.docx
@@ -13,7 +13,7 @@
           <w:color w:val="E54C09"/>
           <w:sz w:val="26"/>
         </w:rPr>
-        <w:t>HEIIU ENGLISH ACADEMY · COMMUNITY MANAGER</w:t>
+        <w:t>HEIIU ENGLISH ACADEMY + PCG CONSTRUCTORA · COMMUNITY MANAGER DOS MARCAS</w:t>
       </w:r>
     </w:p>
     <w:p>
@@ -51,7 +51,7 @@
           <w:b w:val="0"/>
           <w:sz w:val="19"/>
         </w:rPr>
-        <w:t>Te asignamos un tema (la ficha al final de este documento). Tú escribes el guion de un video de 20 segundos, lo grabas desde tu casa, lo editas y lo entregas junto con el guion escrito. Es el trabajo real del cargo en el contenido orgánico: recibir una idea y convertirla en una pieza que respete el mensaje de la academia. No buscamos producción de agencia: buscamos criterio, mensaje y ejecución limpia.</w:t>
+        <w:t>Te asignamos un tema (la ficha al final de este documento). Tú escribes el guion de un video de 20 segundos, lo grabas desde tu casa, lo editas y lo entregas junto con el guion escrito. Es el trabajo real del cargo en el contenido orgánico de las dos marcas, Heiiu y PCG Constructora: recibir una idea y convertirla en una pieza que respete el mensaje de cada marca. Para este ejercicio usaremos la academia. No buscamos producción de agencia: buscamos criterio, mensaje y ejecución limpia.</w:t>
       </w:r>
     </w:p>
     <w:p>
@@ -63,7 +63,7 @@
           <w:b/>
           <w:sz w:val="19"/>
         </w:rPr>
-        <w:t>La prueba no tiene pago. Si la academia publica tu video en sus redes o en pauta, te paga $100.000 por la pieza, pases o no el proceso. Si no se publica, el video sigue siendo tuyo y puedes usarlo en tu portafolio.</w:t>
+        <w:t>La prueba no tiene pago. Si la academia publica tu video en sus redes o en pauta, te paga $100.000 por la pieza, pases o no el proceso. Se publique o no, puedes usar el video en tu portafolio.</w:t>
       </w:r>
     </w:p>
     <w:p>
@@ -76,7 +76,7 @@
           <w:color w:val="E54C09"/>
           <w:sz w:val="22"/>
         </w:rPr>
-        <w:t>2. El mensaje de la academia (lo que no cambia, sea cual sea el tema)</w:t>
+        <w:t>2. El mensaje de la academia (lo que no cambia, sea cual sea el tema; la constructora tiene sus propias reglas, que se entregan aparte)</w:t>
       </w:r>
     </w:p>
     <w:p>
@@ -125,6 +125,18 @@
           <w:sz w:val="19"/>
         </w:rPr>
         <w:t>Cierre siempre a WhatsApp: "Escríbenos" o "Pregúntanos", con el logo de Heiiu solo en el último segundo.</w:t>
+      </w:r>
+    </w:p>
+    <w:p>
+      <w:pPr>
+        <w:pStyle w:val="ListBullet"/>
+        <w:spacing w:after="0"/>
+      </w:pPr>
+      <w:r>
+        <w:rPr>
+          <w:sz w:val="19"/>
+        </w:rPr>
+        <w:t>Todos los videos le hablan a personas desde los 17 años. No se hacen piezas dirigidas a menores.</w:t>
       </w:r>
     </w:p>
     <w:p>
@@ -258,7 +270,7 @@
         <w:rPr>
           <w:sz w:val="19"/>
         </w:rPr>
-        <w:t>El video terminado, nombrado CMP_[letra de tu ficha]_20s.mp4, enviado al WhatsApp de gerencia como DOCUMENTO, no como video, para que no se comprima.</w:t>
+        <w:t>El video terminado, nombrado CMP_[letra de tu ficha]_20s.mp4, enviado por correo electrónico al correo que te indicamos al confirmar, como adjunto o como enlace de Drive o WeTransfer, para que no se comprima. Nunca como video por WhatsApp.</w:t>
       </w:r>
     </w:p>
     <w:p>
@@ -282,7 +294,7 @@
         <w:rPr>
           <w:sz w:val="19"/>
         </w:rPr>
-        <w:t>Dudas antes de grabar, por WhatsApp a gerencia. Lo que no esté en la ficha se pregunta; preferimos la pregunta a la suposición.</w:t>
+        <w:t>Dudas antes de grabar, por correo. Lo que no esté en la ficha se pregunta; preferimos la pregunta a la suposición.</w:t>
       </w:r>
     </w:p>
     <w:p>
@@ -523,7 +535,7 @@
                 <w:b w:val="0"/>
                 <w:sz w:val="18"/>
               </w:rPr>
-              <w:t>9:16, 1080x1920, MP4, 18 a 25 segundos, nombre exacto, enviado como documento.</w:t>
+              <w:t>9:16, 1080x1920, MP4, 18 a 25 segundos, nombre exacto, enviado por correo o enlace sin comprimir.</w:t>
             </w:r>
           </w:p>
         </w:tc>
@@ -628,7 +640,7 @@
           <w:b w:val="0"/>
           <w:sz w:val="19"/>
         </w:rPr>
-        <w:t>Si pasas, se firma el contrato de prestación de servicios para las dos marcas (Heiiu y PCG Constructora) en las condiciones conversadas: anuncios de pauta desde guiones escritos por gerencia, grabados en la academia con profesores y estudiantes, y contenido orgánico con parrilla mensual e informe de resultados. Publicar hace parte del trabajo.</w:t>
+        <w:t>Si pasas, se firma el contrato de prestación de servicios para las dos marcas, Heiiu y PCG Constructora, en las condiciones conversadas. En cada marca el trabajo tiene dos partes: los anuncios de pauta desde guiones escritos por gerencia (en la academia, grabados con profesores y estudiantes; en la constructora, en sus proyectos), y el contenido orgánico con parrilla mensual e informe de resultados (Heiiu: Instagram, TikTok y Facebook; PCG Constructora: Instagram y Facebook). Publicar hace parte del trabajo.</w:t>
       </w:r>
     </w:p>
     <w:p>
@@ -740,7 +752,7 @@
                 <w:b w:val="0"/>
                 <w:sz w:val="18"/>
               </w:rPr>
-              <w:t>Profesionales de 25 a 40 años que ven vacantes que piden inglés y las pasan de largo.</w:t>
+              <w:t>Jóvenes y profesionales desde los 17 años que ven vacantes o convocatorias que piden inglés y las pasan de largo.</w:t>
             </w:r>
           </w:p>
         </w:tc>
@@ -986,7 +998,7 @@
                 <w:b w:val="0"/>
                 <w:sz w:val="18"/>
               </w:rPr>
-              <w:t>Recepcionistas, asistentes y coordinadoras de clínicas estéticas, odontológicas y consultorios de Bucaramanga que reciben pacientes del exterior.</w:t>
+              <w:t>Recepcionistas, asistentes y coordinadoras, desde los 17 años, de clínicas estéticas, odontológicas y consultorios de Bucaramanga que reciben pacientes del exterior.</w:t>
             </w:r>
           </w:p>
         </w:tc>
@@ -1232,7 +1244,7 @@
                 <w:b w:val="0"/>
                 <w:sz w:val="18"/>
               </w:rPr>
-              <w:t>Enfermeras y auxiliares de enfermería de Bucaramanga, de 22 a 40 años.</w:t>
+              <w:t>Enfermeras, auxiliares y estudiantes de enfermería de Bucaramanga, desde los 17 años.</w:t>
             </w:r>
           </w:p>
         </w:tc>
@@ -1478,7 +1490,7 @@
                 <w:b w:val="0"/>
                 <w:sz w:val="18"/>
               </w:rPr>
-              <w:t>Cualquier adulto que ya intentó aprender inglés y no pasó del nivel básico.</w:t>
+              <w:t>Cualquier persona desde los 17 años que ya intentó aprender inglés y no pasó del nivel básico.</w:t>
             </w:r>
           </w:p>
         </w:tc>

</xml_diff>

<commit_message>
Prueba CM: tres instrucciones fijas por ficha (criterio propio + seguir instrucciones)
Co-Authored-By: Claude Fable 5.1 <noreply@anthropic.com>
</commit_message>
<xml_diff>
--- a/recursos/comercial/contratacion/COMMUNITY_MANAGER/PRUEBA_4_VIDEOS_CM.docx
+++ b/recursos/comercial/contratacion/COMMUNITY_MANAGER/PRUEBA_4_VIDEOS_CM.docx
@@ -51,7 +51,7 @@
           <w:b w:val="0"/>
           <w:sz w:val="19"/>
         </w:rPr>
-        <w:t>Te asignamos un tema (la ficha al final de este documento). Tú escribes el guion de un video de 20 segundos, lo grabas desde tu casa, lo editas y lo entregas junto con el guion escrito. En el cargo real, el contenido orgánico de las dos marcas (Heiiu y PCG Constructora) es híbrido: unas veces gerencia entrega el guion y otras lo escribe el CM a partir de una idea. En esta prueba lo escribes tú, porque es lo que necesitamos ver. Para este ejercicio usaremos la academia. No buscamos producción de agencia: buscamos criterio, mensaje y ejecución limpia. Puedes apoyarte en las herramientas que quieras para escribir; lo que evaluamos es que el mensaje respete las reglas y suene a una persona hablándole a otra, no a una plantilla.</w:t>
+        <w:t>Te asignamos un tema (la ficha al final de este documento). Tú escribes el guion de un video de 20 segundos, lo grabas desde tu casa, lo editas y lo entregas junto con el guion escrito. En el cargo real, el contenido orgánico de las dos marcas (Heiiu y PCG Constructora) es híbrido: unas veces gerencia entrega el guion y otras lo escribe el CM a partir de una idea. En esta prueba lo escribes tú a partir de la idea de la ficha, y además cumples tal cual las tres instrucciones fijas que trae la ficha: así vemos las dos cosas, criterio propio y seguir instrucciones. Para este ejercicio usaremos la academia. No buscamos producción de agencia: buscamos criterio, mensaje y ejecución limpia. Puedes apoyarte en las herramientas que quieras para escribir; lo que evaluamos es que el mensaje respete las reglas y suene a una persona hablándole a otra, no a una plantilla.</w:t>
       </w:r>
     </w:p>
     <w:p>
@@ -446,7 +446,7 @@
                 <w:b/>
                 <w:sz w:val="18"/>
               </w:rPr>
-              <w:t>3. Guion</w:t>
+              <w:t>3. Guion e instrucciones</w:t>
             </w:r>
           </w:p>
         </w:tc>
@@ -463,7 +463,7 @@
                 <w:b w:val="0"/>
                 <w:sz w:val="18"/>
               </w:rPr>
-              <w:t>Entregado en la tabla de cuatro columnas y ejecutado como se escribió. Se nota que primero se pensó y después se grabó.</w:t>
+              <w:t>Guion entregado en la tabla de cuatro columnas y ejecutado como se escribió. Las tres instrucciones fijas de la ficha cumplidas tal cual. Se nota que primero se pensó y después se grabó.</w:t>
             </w:r>
           </w:p>
         </w:tc>
@@ -879,6 +879,42 @@
                 <w:b/>
                 <w:sz w:val="18"/>
               </w:rPr>
+              <w:t>Tres instrucciones fijas (se cumplen tal cual)</w:t>
+            </w:r>
+          </w:p>
+        </w:tc>
+        <w:tc>
+          <w:tcPr>
+            <w:tcW w:type="dxa" w:w="7143"/>
+          </w:tcPr>
+          <w:p>
+            <w:pPr>
+              <w:spacing w:after="0"/>
+            </w:pPr>
+            <w:r>
+              <w:rPr>
+                <w:b w:val="0"/>
+                <w:sz w:val="18"/>
+              </w:rPr>
+              <w:t>1. En algún momento del video se escribe a mano, frente a la cámara y legible, la cifra "575 h" (las horas del programa completo). · 2. La frase final, dicha tal cual: "Pregúntanos qué fecha te queda. Escríbenos." · 3. El logo de Heiiu aparece solo en el último segundo; antes, nunca.</w:t>
+            </w:r>
+          </w:p>
+        </w:tc>
+      </w:tr>
+      <w:tr>
+        <w:tc>
+          <w:tcPr>
+            <w:tcW w:type="dxa" w:w="2608"/>
+          </w:tcPr>
+          <w:p>
+            <w:pPr>
+              <w:spacing w:after="0"/>
+            </w:pPr>
+            <w:r>
+              <w:rPr>
+                <w:b/>
+                <w:sz w:val="18"/>
+              </w:rPr>
               <w:t>Archivo</w:t>
             </w:r>
           </w:p>
@@ -1107,6 +1143,42 @@
                 <w:sz w:val="18"/>
               </w:rPr>
               <w:t>La persona con el celular en la mano leyendo un mensaje en inglés (inventado, sin nombres) y levantando la mirada: "¿Y ahora quién le responde?"</w:t>
+            </w:r>
+          </w:p>
+        </w:tc>
+      </w:tr>
+      <w:tr>
+        <w:tc>
+          <w:tcPr>
+            <w:tcW w:type="dxa" w:w="2608"/>
+          </w:tcPr>
+          <w:p>
+            <w:pPr>
+              <w:spacing w:after="0"/>
+            </w:pPr>
+            <w:r>
+              <w:rPr>
+                <w:b/>
+                <w:sz w:val="18"/>
+              </w:rPr>
+              <w:t>Tres instrucciones fijas (se cumplen tal cual)</w:t>
+            </w:r>
+          </w:p>
+        </w:tc>
+        <w:tc>
+          <w:tcPr>
+            <w:tcW w:type="dxa" w:w="7143"/>
+          </w:tcPr>
+          <w:p>
+            <w:pPr>
+              <w:spacing w:after="0"/>
+            </w:pPr>
+            <w:r>
+              <w:rPr>
+                <w:b w:val="0"/>
+                <w:sz w:val="18"/>
+              </w:rPr>
+              <w:t>1. En algún momento del video se dice, en inglés y a cámara, una frase completa de atención al paciente (por ejemplo, confirmar una cita), con su subtítulo. · 2. La frase final, dicha tal cual: "Pregúntanos qué fecha te queda. Escríbenos." · 3. El logo de Heiiu aparece solo en el último segundo; antes, nunca.</w:t>
             </w:r>
           </w:p>
         </w:tc>
@@ -1371,6 +1443,42 @@
                 <w:b/>
                 <w:sz w:val="18"/>
               </w:rPr>
+              <w:t>Tres instrucciones fijas (se cumplen tal cual)</w:t>
+            </w:r>
+          </w:p>
+        </w:tc>
+        <w:tc>
+          <w:tcPr>
+            <w:tcW w:type="dxa" w:w="7143"/>
+          </w:tcPr>
+          <w:p>
+            <w:pPr>
+              <w:spacing w:after="0"/>
+            </w:pPr>
+            <w:r>
+              <w:rPr>
+                <w:b w:val="0"/>
+                <w:sz w:val="18"/>
+              </w:rPr>
+              <w:t>1. En algún momento del video aparece en pantalla, en texto grande, la palabra "GARANTÍA POR ESCRITO" en naranja de marca. · 2. La frase final, dicha tal cual: "Pregúntanos qué fecha te queda. Escríbenos." · 3. El logo de Heiiu aparece solo en el último segundo; antes, nunca.</w:t>
+            </w:r>
+          </w:p>
+        </w:tc>
+      </w:tr>
+      <w:tr>
+        <w:tc>
+          <w:tcPr>
+            <w:tcW w:type="dxa" w:w="2608"/>
+          </w:tcPr>
+          <w:p>
+            <w:pPr>
+              <w:spacing w:after="0"/>
+            </w:pPr>
+            <w:r>
+              <w:rPr>
+                <w:b/>
+                <w:sz w:val="18"/>
+              </w:rPr>
               <w:t>Archivo</w:t>
             </w:r>
           </w:p>
@@ -1599,6 +1707,42 @@
                 <w:sz w:val="18"/>
               </w:rPr>
               <w:t>La persona escribe en una hoja "FÁCIL" y lo tacha; debajo escribe "INTENSO". Y a cámara: "Lo primero no te lo vamos a decir. Lo segundo, sí."</w:t>
+            </w:r>
+          </w:p>
+        </w:tc>
+      </w:tr>
+      <w:tr>
+        <w:tc>
+          <w:tcPr>
+            <w:tcW w:type="dxa" w:w="2608"/>
+          </w:tcPr>
+          <w:p>
+            <w:pPr>
+              <w:spacing w:after="0"/>
+            </w:pPr>
+            <w:r>
+              <w:rPr>
+                <w:b/>
+                <w:sz w:val="18"/>
+              </w:rPr>
+              <w:t>Tres instrucciones fijas (se cumplen tal cual)</w:t>
+            </w:r>
+          </w:p>
+        </w:tc>
+        <w:tc>
+          <w:tcPr>
+            <w:tcW w:type="dxa" w:w="7143"/>
+          </w:tcPr>
+          <w:p>
+            <w:pPr>
+              <w:spacing w:after="0"/>
+            </w:pPr>
+            <w:r>
+              <w:rPr>
+                <w:b w:val="0"/>
+                <w:sz w:val="18"/>
+              </w:rPr>
+              <w:t>1. En algún momento del video se dice, tal cual: "Todos los días grabas un video corto en inglés y tu profesor te lo devuelve con una mejora." · 2. La frase final, dicha tal cual: "Pregúntanos qué fecha te queda. Escríbenos." · 3. El logo de Heiiu aparece solo en el último segundo; antes, nunca.</w:t>
             </w:r>
           </w:p>
         </w:tc>

</xml_diff>